<commit_message>
Move 네일 케어 to DAY1 after shopping in ₩1,990,000 package
Co-Authored-By: Claude Sonnet 4.6 <noreply@anthropic.com>
Claude-Session: https://claude.ai/code/session_01MLXVgnN287g9x8qaYbB4vD
</commit_message>
<xml_diff>
--- a/packages/고객공유용_199만원_SeoulRenewal.docx
+++ b/packages/고객공유용_199만원_SeoulRenewal.docx
@@ -382,7 +382,177 @@
               <w:br/>
               <w:t>~</w:t>
               <w:br/>
-              <w:t>14:30</w:t>
+              <w:t>15:00</w:t>
+            </w:r>
+          </w:p>
+        </w:tc>
+        <w:tc>
+          <w:tcPr>
+            <w:tcW w:type="dxa" w:w="6520"/>
+          </w:tcPr>
+          <w:p>
+            <w:pPr>
+              <w:spacing w:before="20" w:after="20"/>
+            </w:pPr>
+            <w:r>
+              <w:rPr>
+                <w:rFonts w:ascii="Malgun Gothic" w:hAnsi="Malgun Gothic"/>
+                <w:b/>
+                <w:sz w:val="18"/>
+              </w:rPr>
+              <w:t>네일 케어  (90분)</w:t>
+            </w:r>
+          </w:p>
+          <w:p>
+            <w:pPr>
+              <w:spacing w:before="20" w:after="20"/>
+            </w:pPr>
+            <w:r>
+              <w:rPr>
+                <w:rFonts w:ascii="Malgun Gothic" w:hAnsi="Malgun Gothic"/>
+                <w:sz w:val="18"/>
+              </w:rPr>
+              <w:t>· 손톱 &amp; 발톱 기본 관리</w:t>
+            </w:r>
+          </w:p>
+          <w:p>
+            <w:pPr>
+              <w:spacing w:before="20" w:after="20"/>
+            </w:pPr>
+            <w:r>
+              <w:rPr>
+                <w:rFonts w:ascii="Malgun Gothic" w:hAnsi="Malgun Gothic"/>
+                <w:sz w:val="18"/>
+              </w:rPr>
+              <w:t>· 젤 네일 컬러링 (퍼스널컬러 기반 추천)</w:t>
+            </w:r>
+          </w:p>
+          <w:p>
+            <w:pPr>
+              <w:spacing w:before="20" w:after="20"/>
+            </w:pPr>
+            <w:r>
+              <w:rPr>
+                <w:rFonts w:ascii="Malgun Gothic" w:hAnsi="Malgun Gothic"/>
+                <w:sz w:val="18"/>
+              </w:rPr>
+              <w:t>· 큐티클 정리 + 핸드케어</w:t>
+            </w:r>
+          </w:p>
+          <w:p>
+            <w:pPr>
+              <w:spacing w:before="20" w:after="20"/>
+            </w:pPr>
+            <w:r>
+              <w:rPr>
+                <w:rFonts w:ascii="Malgun Gothic" w:hAnsi="Malgun Gothic"/>
+                <w:sz w:val="18"/>
+              </w:rPr>
+            </w:r>
+          </w:p>
+          <w:p>
+            <w:pPr>
+              <w:spacing w:before="20" w:after="20"/>
+            </w:pPr>
+            <w:r>
+              <w:rPr>
+                <w:rFonts w:ascii="Malgun Gothic" w:hAnsi="Malgun Gothic"/>
+                <w:sz w:val="18"/>
+              </w:rPr>
+              <w:t>추천 업체 TOP5</w:t>
+            </w:r>
+          </w:p>
+          <w:p>
+            <w:pPr>
+              <w:spacing w:before="20" w:after="20"/>
+            </w:pPr>
+            <w:r>
+              <w:rPr>
+                <w:rFonts w:ascii="Malgun Gothic" w:hAnsi="Malgun Gothic"/>
+                <w:sz w:val="18"/>
+              </w:rPr>
+              <w:t>① 네일팝  ② 에뛰드 네일  ③ 글로시네일</w:t>
+            </w:r>
+          </w:p>
+          <w:p>
+            <w:pPr>
+              <w:spacing w:before="20" w:after="20"/>
+            </w:pPr>
+            <w:r>
+              <w:rPr>
+                <w:rFonts w:ascii="Malgun Gothic" w:hAnsi="Malgun Gothic"/>
+                <w:sz w:val="18"/>
+              </w:rPr>
+              <w:t>④ 핑크네일 명동  ⑤ 네일아트 클럽</w:t>
+            </w:r>
+          </w:p>
+          <w:p>
+            <w:pPr>
+              <w:spacing w:before="20" w:after="20"/>
+            </w:pPr>
+            <w:r>
+              <w:rPr>
+                <w:rFonts w:ascii="Malgun Gothic" w:hAnsi="Malgun Gothic"/>
+                <w:sz w:val="18"/>
+              </w:rPr>
+            </w:r>
+          </w:p>
+          <w:p>
+            <w:pPr>
+              <w:spacing w:before="20" w:after="20"/>
+            </w:pPr>
+            <w:r>
+              <w:rPr>
+                <w:rFonts w:ascii="Malgun Gothic" w:hAnsi="Malgun Gothic"/>
+                <w:sz w:val="18"/>
+              </w:rPr>
+              <w:t>💡 여행 첫날 네일을 완성하면 남은 일정 내내 손이 예뻐 보임.</w:t>
+            </w:r>
+          </w:p>
+          <w:p>
+            <w:pPr>
+              <w:spacing w:before="20" w:after="20"/>
+            </w:pPr>
+            <w:r>
+              <w:rPr>
+                <w:rFonts w:ascii="Malgun Gothic" w:hAnsi="Malgun Gothic"/>
+                <w:sz w:val="18"/>
+              </w:rPr>
+              <w:t xml:space="preserve">   쇼핑 직후 퍼스널컬러 기반 컬러 선택으로 구매한 제품과 룩 통일</w:t>
+            </w:r>
+          </w:p>
+        </w:tc>
+        <w:tc>
+          <w:tcPr>
+            <w:tcW w:type="dxa" w:w="1417"/>
+          </w:tcPr>
+          <w:p>
+            <w:r>
+              <w:rPr>
+                <w:rFonts w:ascii="Malgun Gothic" w:hAnsi="Malgun Gothic"/>
+                <w:sz w:val="18"/>
+              </w:rPr>
+              <w:t>✅ 포함</w:t>
+            </w:r>
+          </w:p>
+        </w:tc>
+      </w:tr>
+      <w:tr>
+        <w:tc>
+          <w:tcPr>
+            <w:tcW w:type="dxa" w:w="1134"/>
+          </w:tcPr>
+          <w:p>
+            <w:r>
+              <w:rPr>
+                <w:rFonts w:ascii="Malgun Gothic" w:hAnsi="Malgun Gothic"/>
+                <w:sz w:val="18"/>
+              </w:rPr>
+              <w:t>15:00</w:t>
+              <w:br/>
+              <w:t>~</w:t>
+              <w:br/>
+              <w:t>16:00</w:t>
             </w:r>
           </w:p>
         </w:tc>
@@ -477,11 +647,11 @@
                 <w:rFonts w:ascii="Malgun Gothic" w:hAnsi="Malgun Gothic"/>
                 <w:sz w:val="18"/>
               </w:rPr>
-              <w:t>14:30</w:t>
+              <w:t>16:00</w:t>
               <w:br/>
               <w:t>~</w:t>
               <w:br/>
-              <w:t>16:30</w:t>
+              <w:t>18:00</w:t>
             </w:r>
           </w:p>
         </w:tc>
@@ -671,11 +841,11 @@
                 <w:rFonts w:ascii="Malgun Gothic" w:hAnsi="Malgun Gothic"/>
                 <w:sz w:val="18"/>
               </w:rPr>
-              <w:t>16:30</w:t>
+              <w:t>18:00</w:t>
               <w:br/>
               <w:t>~</w:t>
               <w:br/>
-              <w:t>18:00</w:t>
+              <w:t>19:30</w:t>
             </w:r>
           </w:p>
         </w:tc>
@@ -1943,177 +2113,7 @@
               <w:br/>
               <w:t>~</w:t>
               <w:br/>
-              <w:t>11:30</w:t>
-            </w:r>
-          </w:p>
-        </w:tc>
-        <w:tc>
-          <w:tcPr>
-            <w:tcW w:type="dxa" w:w="6520"/>
-          </w:tcPr>
-          <w:p>
-            <w:pPr>
-              <w:spacing w:before="20" w:after="20"/>
-            </w:pPr>
-            <w:r>
-              <w:rPr>
-                <w:rFonts w:ascii="Malgun Gothic" w:hAnsi="Malgun Gothic"/>
-                <w:b/>
-                <w:sz w:val="18"/>
-              </w:rPr>
-              <w:t>네일 케어  (90분)</w:t>
-            </w:r>
-          </w:p>
-          <w:p>
-            <w:pPr>
-              <w:spacing w:before="20" w:after="20"/>
-            </w:pPr>
-            <w:r>
-              <w:rPr>
-                <w:rFonts w:ascii="Malgun Gothic" w:hAnsi="Malgun Gothic"/>
-                <w:sz w:val="18"/>
-              </w:rPr>
-              <w:t>· 손톱 &amp; 발톱 기본 관리</w:t>
-            </w:r>
-          </w:p>
-          <w:p>
-            <w:pPr>
-              <w:spacing w:before="20" w:after="20"/>
-            </w:pPr>
-            <w:r>
-              <w:rPr>
-                <w:rFonts w:ascii="Malgun Gothic" w:hAnsi="Malgun Gothic"/>
-                <w:sz w:val="18"/>
-              </w:rPr>
-              <w:t>· 젤 네일 컬러링 (퍼스널컬러 기반 추천)</w:t>
-            </w:r>
-          </w:p>
-          <w:p>
-            <w:pPr>
-              <w:spacing w:before="20" w:after="20"/>
-            </w:pPr>
-            <w:r>
-              <w:rPr>
-                <w:rFonts w:ascii="Malgun Gothic" w:hAnsi="Malgun Gothic"/>
-                <w:sz w:val="18"/>
-              </w:rPr>
-              <w:t>· 큐티클 정리 + 핸드케어</w:t>
-            </w:r>
-          </w:p>
-          <w:p>
-            <w:pPr>
-              <w:spacing w:before="20" w:after="20"/>
-            </w:pPr>
-            <w:r>
-              <w:rPr>
-                <w:rFonts w:ascii="Malgun Gothic" w:hAnsi="Malgun Gothic"/>
-                <w:sz w:val="18"/>
-              </w:rPr>
-            </w:r>
-          </w:p>
-          <w:p>
-            <w:pPr>
-              <w:spacing w:before="20" w:after="20"/>
-            </w:pPr>
-            <w:r>
-              <w:rPr>
-                <w:rFonts w:ascii="Malgun Gothic" w:hAnsi="Malgun Gothic"/>
-                <w:sz w:val="18"/>
-              </w:rPr>
-              <w:t>추천 업체 TOP5</w:t>
-            </w:r>
-          </w:p>
-          <w:p>
-            <w:pPr>
-              <w:spacing w:before="20" w:after="20"/>
-            </w:pPr>
-            <w:r>
-              <w:rPr>
-                <w:rFonts w:ascii="Malgun Gothic" w:hAnsi="Malgun Gothic"/>
-                <w:sz w:val="18"/>
-              </w:rPr>
-              <w:t>① 네일팝  ② 에뛰드 네일  ③ 글로시네일</w:t>
-            </w:r>
-          </w:p>
-          <w:p>
-            <w:pPr>
-              <w:spacing w:before="20" w:after="20"/>
-            </w:pPr>
-            <w:r>
-              <w:rPr>
-                <w:rFonts w:ascii="Malgun Gothic" w:hAnsi="Malgun Gothic"/>
-                <w:sz w:val="18"/>
-              </w:rPr>
-              <w:t>④ 핑크네일 명동  ⑤ 네일아트 클럽</w:t>
-            </w:r>
-          </w:p>
-          <w:p>
-            <w:pPr>
-              <w:spacing w:before="20" w:after="20"/>
-            </w:pPr>
-            <w:r>
-              <w:rPr>
-                <w:rFonts w:ascii="Malgun Gothic" w:hAnsi="Malgun Gothic"/>
-                <w:sz w:val="18"/>
-              </w:rPr>
-            </w:r>
-          </w:p>
-          <w:p>
-            <w:pPr>
-              <w:spacing w:before="20" w:after="20"/>
-            </w:pPr>
-            <w:r>
-              <w:rPr>
-                <w:rFonts w:ascii="Malgun Gothic" w:hAnsi="Malgun Gothic"/>
-                <w:sz w:val="18"/>
-              </w:rPr>
-              <w:t>💡 손끝까지 완성된 모습으로 촬영.</w:t>
-            </w:r>
-          </w:p>
-          <w:p>
-            <w:pPr>
-              <w:spacing w:before="20" w:after="20"/>
-            </w:pPr>
-            <w:r>
-              <w:rPr>
-                <w:rFonts w:ascii="Malgun Gothic" w:hAnsi="Malgun Gothic"/>
-                <w:sz w:val="18"/>
-              </w:rPr>
-              <w:t xml:space="preserve">   퍼스널컬러 기반 컬러 선택으로 전체 룩 통일감</w:t>
-            </w:r>
-          </w:p>
-        </w:tc>
-        <w:tc>
-          <w:tcPr>
-            <w:tcW w:type="dxa" w:w="1417"/>
-          </w:tcPr>
-          <w:p>
-            <w:r>
-              <w:rPr>
-                <w:rFonts w:ascii="Malgun Gothic" w:hAnsi="Malgun Gothic"/>
-                <w:sz w:val="18"/>
-              </w:rPr>
-              <w:t>✅ 포함</w:t>
-            </w:r>
-          </w:p>
-        </w:tc>
-      </w:tr>
-      <w:tr>
-        <w:tc>
-          <w:tcPr>
-            <w:tcW w:type="dxa" w:w="1134"/>
-          </w:tcPr>
-          <w:p>
-            <w:r>
-              <w:rPr>
-                <w:rFonts w:ascii="Malgun Gothic" w:hAnsi="Malgun Gothic"/>
-                <w:sz w:val="18"/>
-              </w:rPr>
-              <w:t>11:30</w:t>
-              <w:br/>
-              <w:t>~</w:t>
-              <w:br/>
-              <w:t>12:30</w:t>
+              <w:t>11:00</w:t>
             </w:r>
           </w:p>
         </w:tc>
@@ -2269,11 +2269,11 @@
                 <w:rFonts w:ascii="Malgun Gothic" w:hAnsi="Malgun Gothic"/>
                 <w:sz w:val="18"/>
               </w:rPr>
-              <w:t>13:00</w:t>
+              <w:t>11:00</w:t>
               <w:br/>
               <w:t>~</w:t>
               <w:br/>
-              <w:t>15:00</w:t>
+              <w:t>13:00</w:t>
             </w:r>
           </w:p>
         </w:tc>
@@ -2439,7 +2439,7 @@
                 <w:rFonts w:ascii="Malgun Gothic" w:hAnsi="Malgun Gothic"/>
                 <w:sz w:val="18"/>
               </w:rPr>
-              <w:t>15:00</w:t>
+              <w:t>13:00</w:t>
             </w:r>
           </w:p>
         </w:tc>
@@ -2621,6 +2621,17 @@
         <w:rPr>
           <w:rFonts w:ascii="Malgun Gothic" w:hAnsi="Malgun Gothic"/>
         </w:rPr>
+        <w:t>DAY1  네일 케어</w:t>
+      </w:r>
+    </w:p>
+    <w:p>
+      <w:pPr>
+        <w:pStyle w:val="ListBullet"/>
+      </w:pPr>
+      <w:r>
+        <w:rPr>
+          <w:rFonts w:ascii="Malgun Gothic" w:hAnsi="Malgun Gothic"/>
+        </w:rPr>
         <w:t>DAY1  피부진단 &amp; 에스테틱</w:t>
       </w:r>
     </w:p>
@@ -2699,17 +2710,6 @@
           <w:rFonts w:ascii="Malgun Gothic" w:hAnsi="Malgun Gothic"/>
         </w:rPr>
         <w:t>DAY2  전신 마사지</w:t>
-      </w:r>
-    </w:p>
-    <w:p>
-      <w:pPr>
-        <w:pStyle w:val="ListBullet"/>
-      </w:pPr>
-      <w:r>
-        <w:rPr>
-          <w:rFonts w:ascii="Malgun Gothic" w:hAnsi="Malgun Gothic"/>
-        </w:rPr>
-        <w:t>DAY3  네일 케어</w:t>
       </w:r>
     </w:p>
     <w:p>

</xml_diff>

<commit_message>
Replace 자카페 with 티 오마카세 across all packages
Co-Authored-By: Claude Sonnet 4.6 <noreply@anthropic.com>
Claude-Session: https://claude.ai/code/session_01MLXVgnN287g9x8qaYbB4vD
</commit_message>
<xml_diff>
--- a/packages/고객공유용_199만원_SeoulRenewal.docx
+++ b/packages/고객공유용_199만원_SeoulRenewal.docx
@@ -570,7 +570,7 @@
                 <w:b/>
                 <w:sz w:val="18"/>
               </w:rPr>
-              <w:t>자(cha) 카페  (1시간)</w:t>
+              <w:t>티 오마카세  (1시간)</w:t>
             </w:r>
           </w:p>
           <w:p>
@@ -582,7 +582,7 @@
                 <w:rFonts w:ascii="Malgun Gothic" w:hAnsi="Malgun Gothic"/>
                 <w:sz w:val="18"/>
               </w:rPr>
-              <w:t>· 한국 힙한 전통차 카페 경험</w:t>
+              <w:t>· 전통차 소믈리에가 선별한 계절 차 코스 제공</w:t>
             </w:r>
           </w:p>
           <w:p>
@@ -594,7 +594,19 @@
                 <w:rFonts w:ascii="Malgun Gothic" w:hAnsi="Malgun Gothic"/>
                 <w:sz w:val="18"/>
               </w:rPr>
-              <w:t>· 음료 1잔 포함 / 인스타그래머블 공간</w:t>
+              <w:t>· 차 설명 + 다과 페어링 포함</w:t>
+            </w:r>
+          </w:p>
+          <w:p>
+            <w:pPr>
+              <w:spacing w:before="20" w:after="20"/>
+            </w:pPr>
+            <w:r>
+              <w:rPr>
+                <w:rFonts w:ascii="Malgun Gothic" w:hAnsi="Malgun Gothic"/>
+                <w:sz w:val="18"/>
+              </w:rPr>
+              <w:t>· 명동·인사동 인근 프리미엄 티룸</w:t>
             </w:r>
           </w:p>
           <w:p>
@@ -617,7 +629,66 @@
                 <w:rFonts w:ascii="Malgun Gothic" w:hAnsi="Malgun Gothic"/>
                 <w:sz w:val="18"/>
               </w:rPr>
-              <w:t>💡 오후 시술 전 충분한 휴식</w:t>
+              <w:t>추천 업체 TOP5</w:t>
+            </w:r>
+          </w:p>
+          <w:p>
+            <w:pPr>
+              <w:spacing w:before="20" w:after="20"/>
+            </w:pPr>
+            <w:r>
+              <w:rPr>
+                <w:rFonts w:ascii="Malgun Gothic" w:hAnsi="Malgun Gothic"/>
+                <w:sz w:val="18"/>
+              </w:rPr>
+              <w:t>① 오설록 티하우스  ② 차마시는 뜰  ③ 티컬렉티브</w:t>
+            </w:r>
+          </w:p>
+          <w:p>
+            <w:pPr>
+              <w:spacing w:before="20" w:after="20"/>
+            </w:pPr>
+            <w:r>
+              <w:rPr>
+                <w:rFonts w:ascii="Malgun Gothic" w:hAnsi="Malgun Gothic"/>
+                <w:sz w:val="18"/>
+              </w:rPr>
+              <w:t>④ 명가원  ⑤ 오우재</w:t>
+            </w:r>
+          </w:p>
+          <w:p>
+            <w:pPr>
+              <w:spacing w:before="20" w:after="20"/>
+            </w:pPr>
+            <w:r>
+              <w:rPr>
+                <w:rFonts w:ascii="Malgun Gothic" w:hAnsi="Malgun Gothic"/>
+                <w:sz w:val="18"/>
+              </w:rPr>
+            </w:r>
+          </w:p>
+          <w:p>
+            <w:pPr>
+              <w:spacing w:before="20" w:after="20"/>
+            </w:pPr>
+            <w:r>
+              <w:rPr>
+                <w:rFonts w:ascii="Malgun Gothic" w:hAnsi="Malgun Gothic"/>
+                <w:sz w:val="18"/>
+              </w:rPr>
+              <w:t>💡 오후 시술 전 충분한 휴식.</w:t>
+            </w:r>
+          </w:p>
+          <w:p>
+            <w:pPr>
+              <w:spacing w:before="20" w:after="20"/>
+            </w:pPr>
+            <w:r>
+              <w:rPr>
+                <w:rFonts w:ascii="Malgun Gothic" w:hAnsi="Malgun Gothic"/>
+                <w:sz w:val="18"/>
+              </w:rPr>
+              <w:t xml:space="preserve">   프리미엄 차 코스로 패키지 고급감 UP</w:t>
             </w:r>
           </w:p>
         </w:tc>
@@ -2643,7 +2714,7 @@
         <w:rPr>
           <w:rFonts w:ascii="Malgun Gothic" w:hAnsi="Malgun Gothic"/>
         </w:rPr>
-        <w:t>DAY1  자카페 음료 1잔</w:t>
+        <w:t>DAY1  티 오마카세 (전통차 코스 + 다과)</w:t>
       </w:r>
     </w:p>
     <w:p>
@@ -3455,7 +3526,7 @@
                 <w:rFonts w:ascii="Malgun Gothic" w:hAnsi="Malgun Gothic"/>
                 <w:sz w:val="20"/>
               </w:rPr>
-              <w:t>자카페 음료</w:t>
+              <w:t>티 오마카세</w:t>
             </w:r>
           </w:p>
         </w:tc>
@@ -3469,7 +3540,7 @@
                 <w:rFonts w:ascii="Malgun Gothic" w:hAnsi="Malgun Gothic"/>
                 <w:sz w:val="20"/>
               </w:rPr>
-              <w:t>₩12,000</w:t>
+              <w:t>₩40,000</w:t>
             </w:r>
           </w:p>
         </w:tc>
@@ -3799,7 +3870,7 @@
                 <w:rFonts w:ascii="Malgun Gothic" w:hAnsi="Malgun Gothic"/>
                 <w:sz w:val="20"/>
               </w:rPr>
-              <w:t>₩1,187,000</w:t>
+              <w:t>₩1,215,000</w:t>
             </w:r>
           </w:p>
         </w:tc>
@@ -3829,7 +3900,7 @@
                 <w:rFonts w:ascii="Malgun Gothic" w:hAnsi="Malgun Gothic"/>
                 <w:sz w:val="20"/>
               </w:rPr>
-              <w:t>59.6% ✅</w:t>
+              <w:t>61.1% ⚠️</w:t>
             </w:r>
           </w:p>
         </w:tc>

</xml_diff>

<commit_message>
Change curator policy to yes/no (+₩500,000) for ₩1,990,000 package
Co-Authored-By: Claude Sonnet 4.6 <noreply@anthropic.com>
Claude-Session: https://claude.ai/code/session_01MLXVgnN287g9x8qaYbB4vD
</commit_message>
<xml_diff>
--- a/packages/고객공유용_199만원_SeoulRenewal.docx
+++ b/packages/고객공유용_199만원_SeoulRenewal.docx
@@ -30,7 +30,7 @@
           <w:rFonts w:ascii="Malgun Gothic" w:hAnsi="Malgun Gothic"/>
           <w:i/>
         </w:rPr>
-        <w:t>명동·강남 일대  |  큐레이터 동행 옵션</w:t>
+        <w:t>명동·강남 일대  |  전담 큐레이터 동행 여부 선택</w:t>
       </w:r>
     </w:p>
     <w:p/>
@@ -2943,7 +2943,7 @@
                 <w:b/>
                 <w:sz w:val="20"/>
               </w:rPr>
-              <w:t>큐레이터 동행 구간</w:t>
+              <w:t>큐레이터 동행</w:t>
             </w:r>
           </w:p>
         </w:tc>
@@ -2991,7 +2991,7 @@
                 <w:rFonts w:ascii="Malgun Gothic" w:hAnsi="Malgun Gothic"/>
                 <w:sz w:val="20"/>
               </w:rPr>
-              <w:t>없음</w:t>
+              <w:t>미동행</w:t>
             </w:r>
           </w:p>
         </w:tc>
@@ -3035,7 +3035,7 @@
                 <w:rFonts w:ascii="Malgun Gothic" w:hAnsi="Malgun Gothic"/>
                 <w:sz w:val="20"/>
               </w:rPr>
-              <w:t>1구간</w:t>
+              <w:t>동행 (3일 풀동행)</w:t>
             </w:r>
           </w:p>
         </w:tc>
@@ -3049,7 +3049,7 @@
                 <w:rFonts w:ascii="Malgun Gothic" w:hAnsi="Malgun Gothic"/>
                 <w:sz w:val="20"/>
               </w:rPr>
-              <w:t>+₩50,000</w:t>
+              <w:t>+₩500,000</w:t>
             </w:r>
           </w:p>
         </w:tc>
@@ -3063,183 +3063,7 @@
                 <w:rFonts w:ascii="Malgun Gothic" w:hAnsi="Malgun Gothic"/>
                 <w:sz w:val="20"/>
               </w:rPr>
-              <w:t>₩2,040,000</w:t>
-            </w:r>
-          </w:p>
-        </w:tc>
-      </w:tr>
-      <w:tr>
-        <w:tc>
-          <w:tcPr>
-            <w:tcW w:type="dxa" w:w="2880"/>
-          </w:tcPr>
-          <w:p>
-            <w:r>
-              <w:rPr>
-                <w:rFonts w:ascii="Malgun Gothic" w:hAnsi="Malgun Gothic"/>
-                <w:sz w:val="20"/>
-              </w:rPr>
-              <w:t>2구간</w:t>
-            </w:r>
-          </w:p>
-        </w:tc>
-        <w:tc>
-          <w:tcPr>
-            <w:tcW w:type="dxa" w:w="2880"/>
-          </w:tcPr>
-          <w:p>
-            <w:r>
-              <w:rPr>
-                <w:rFonts w:ascii="Malgun Gothic" w:hAnsi="Malgun Gothic"/>
-                <w:sz w:val="20"/>
-              </w:rPr>
-              <w:t>+₩80,000</w:t>
-            </w:r>
-          </w:p>
-        </w:tc>
-        <w:tc>
-          <w:tcPr>
-            <w:tcW w:type="dxa" w:w="2880"/>
-          </w:tcPr>
-          <w:p>
-            <w:r>
-              <w:rPr>
-                <w:rFonts w:ascii="Malgun Gothic" w:hAnsi="Malgun Gothic"/>
-                <w:sz w:val="20"/>
-              </w:rPr>
-              <w:t>₩2,070,000</w:t>
-            </w:r>
-          </w:p>
-        </w:tc>
-      </w:tr>
-      <w:tr>
-        <w:tc>
-          <w:tcPr>
-            <w:tcW w:type="dxa" w:w="2880"/>
-          </w:tcPr>
-          <w:p>
-            <w:r>
-              <w:rPr>
-                <w:rFonts w:ascii="Malgun Gothic" w:hAnsi="Malgun Gothic"/>
-                <w:sz w:val="20"/>
-              </w:rPr>
-              <w:t>3구간</w:t>
-            </w:r>
-          </w:p>
-        </w:tc>
-        <w:tc>
-          <w:tcPr>
-            <w:tcW w:type="dxa" w:w="2880"/>
-          </w:tcPr>
-          <w:p>
-            <w:r>
-              <w:rPr>
-                <w:rFonts w:ascii="Malgun Gothic" w:hAnsi="Malgun Gothic"/>
-                <w:sz w:val="20"/>
-              </w:rPr>
-              <w:t>+₩110,000</w:t>
-            </w:r>
-          </w:p>
-        </w:tc>
-        <w:tc>
-          <w:tcPr>
-            <w:tcW w:type="dxa" w:w="2880"/>
-          </w:tcPr>
-          <w:p>
-            <w:r>
-              <w:rPr>
-                <w:rFonts w:ascii="Malgun Gothic" w:hAnsi="Malgun Gothic"/>
-                <w:sz w:val="20"/>
-              </w:rPr>
-              <w:t>₩2,100,000</w:t>
-            </w:r>
-          </w:p>
-        </w:tc>
-      </w:tr>
-      <w:tr>
-        <w:tc>
-          <w:tcPr>
-            <w:tcW w:type="dxa" w:w="2880"/>
-          </w:tcPr>
-          <w:p>
-            <w:r>
-              <w:rPr>
-                <w:rFonts w:ascii="Malgun Gothic" w:hAnsi="Malgun Gothic"/>
-                <w:sz w:val="20"/>
-              </w:rPr>
-              <w:t>4구간</w:t>
-            </w:r>
-          </w:p>
-        </w:tc>
-        <w:tc>
-          <w:tcPr>
-            <w:tcW w:type="dxa" w:w="2880"/>
-          </w:tcPr>
-          <w:p>
-            <w:r>
-              <w:rPr>
-                <w:rFonts w:ascii="Malgun Gothic" w:hAnsi="Malgun Gothic"/>
-                <w:sz w:val="20"/>
-              </w:rPr>
-              <w:t>+₩130,000</w:t>
-            </w:r>
-          </w:p>
-        </w:tc>
-        <w:tc>
-          <w:tcPr>
-            <w:tcW w:type="dxa" w:w="2880"/>
-          </w:tcPr>
-          <w:p>
-            <w:r>
-              <w:rPr>
-                <w:rFonts w:ascii="Malgun Gothic" w:hAnsi="Malgun Gothic"/>
-                <w:sz w:val="20"/>
-              </w:rPr>
-              <w:t>₩2,120,000</w:t>
-            </w:r>
-          </w:p>
-        </w:tc>
-      </w:tr>
-      <w:tr>
-        <w:tc>
-          <w:tcPr>
-            <w:tcW w:type="dxa" w:w="2880"/>
-          </w:tcPr>
-          <w:p>
-            <w:r>
-              <w:rPr>
-                <w:rFonts w:ascii="Malgun Gothic" w:hAnsi="Malgun Gothic"/>
-                <w:sz w:val="20"/>
-              </w:rPr>
-              <w:t>5구간 (전 구간)</w:t>
-            </w:r>
-          </w:p>
-        </w:tc>
-        <w:tc>
-          <w:tcPr>
-            <w:tcW w:type="dxa" w:w="2880"/>
-          </w:tcPr>
-          <w:p>
-            <w:r>
-              <w:rPr>
-                <w:rFonts w:ascii="Malgun Gothic" w:hAnsi="Malgun Gothic"/>
-                <w:sz w:val="20"/>
-              </w:rPr>
-              <w:t>+₩150,000</w:t>
-            </w:r>
-          </w:p>
-        </w:tc>
-        <w:tc>
-          <w:tcPr>
-            <w:tcW w:type="dxa" w:w="2880"/>
-          </w:tcPr>
-          <w:p>
-            <w:r>
-              <w:rPr>
-                <w:rFonts w:ascii="Malgun Gothic" w:hAnsi="Malgun Gothic"/>
-                <w:sz w:val="20"/>
-              </w:rPr>
-              <w:t>₩2,140,000</w:t>
+              <w:t>₩2,490,000</w:t>
             </w:r>
           </w:p>
         </w:tc>
@@ -3250,7 +3074,7 @@
         <w:rPr>
           <w:rFonts w:ascii="Malgun Gothic" w:hAnsi="Malgun Gothic"/>
         </w:rPr>
-        <w:t>※ 큐레이터는 원하는 구간만 연속으로 선택 가능합니다</w:t>
+        <w:t>※ 큐레이터는 3일 전 일정 풀 동행 — 구간 분리 불가</w:t>
       </w:r>
     </w:p>
     <w:p>

</xml_diff>